<commit_message>
Auto commit every 30 seconds [no ci]
</commit_message>
<xml_diff>
--- a/Struktur_Kepanitiaan_Lomba_17_Agustus.docx
+++ b/Struktur_Kepanitiaan_Lomba_17_Agustus.docx
@@ -15,12 +15,14 @@
         <w:pStyle w:val="Heading1"/>
       </w:pPr>
       <w:r>
-        <w:t>1. Ketua Panitia</w:t>
+        <w:t>Ketua Panitia</w:t>
       </w:r>
     </w:p>
     <w:p>
       <w:r>
-        <w:t>Bertanggung jawab atas seluruh kegiatan panitia dan memastikan semua berjalan sesuai rencana.</w:t>
+        <w:t>Nama: [Nama Ketua]</w:t>
+        <w:br/>
+        <w:t>Tanggung Jawab: Mengkoordinasikan seluruh kegiatan dan memastikan pelaksanaan berjalan lancar.</w:t>
       </w:r>
     </w:p>
     <w:p>
@@ -28,12 +30,14 @@
         <w:pStyle w:val="Heading1"/>
       </w:pPr>
       <w:r>
-        <w:t>2. Sekretaris</w:t>
+        <w:t>Sekretaris</w:t>
       </w:r>
     </w:p>
     <w:p>
       <w:r>
-        <w:t>Mengelola administrasi, surat menyurat, dan komunikasi internal maupun eksternal.</w:t>
+        <w:t>Nama: [Nama Sekretaris]</w:t>
+        <w:br/>
+        <w:t>Tanggung Jawab: Mengurus administrasi, surat-menyurat, dan dokumentasi.</w:t>
       </w:r>
     </w:p>
     <w:p>
@@ -41,12 +45,14 @@
         <w:pStyle w:val="Heading1"/>
       </w:pPr>
       <w:r>
-        <w:t>3. Bendahara</w:t>
+        <w:t>Bendahara</w:t>
       </w:r>
     </w:p>
     <w:p>
       <w:r>
-        <w:t>Mengelola keuangan, mencatat pemasukan dan pengeluaran.</w:t>
+        <w:t>Nama: [Nama Bendahara]</w:t>
+        <w:br/>
+        <w:t>Tanggung Jawab: Mengelola keuangan dan laporan keuangan kegiatan.</w:t>
       </w:r>
     </w:p>
     <w:p>
@@ -54,12 +60,22 @@
         <w:pStyle w:val="Heading1"/>
       </w:pPr>
       <w:r>
-        <w:t>4. Koordinator Acara</w:t>
+        <w:t>Pengarah Acara</w:t>
       </w:r>
     </w:p>
     <w:p>
       <w:r>
-        <w:t>Mengatur jalannya acara lomba dan memastikan semua acara berjalan lancar.</w:t>
+        <w:t>Nama: [Nama Pengarah]</w:t>
+        <w:br/>
+        <w:t>Tanggung Jawab: Menyusun dan mengatur jadwal acara serta memastikan kelancaran acara.</w:t>
+      </w:r>
+    </w:p>
+    <w:p>
+      <w:pPr>
+        <w:pStyle w:val="Heading1"/>
+      </w:pPr>
+      <w:r>
+        <w:t>Divisi-Divisi</w:t>
       </w:r>
     </w:p>
     <w:p>
@@ -67,12 +83,23 @@
         <w:pStyle w:val="Heading2"/>
       </w:pPr>
       <w:r>
-        <w:t xml:space="preserve">   4.1. Penanggung Jawab Lomba</w:t>
+        <w:t>Divisi Humas</w:t>
       </w:r>
     </w:p>
     <w:p>
+      <w:pPr>
+        <w:pStyle w:val="ListBullet"/>
+      </w:pPr>
       <w:r>
-        <w:t>Mengatur dan mengelola berbagai jenis lomba yang diadakan.</w:t>
+        <w:t>Andi</w:t>
+      </w:r>
+    </w:p>
+    <w:p>
+      <w:pPr>
+        <w:pStyle w:val="ListBullet"/>
+      </w:pPr>
+      <w:r>
+        <w:t>Budi</w:t>
       </w:r>
     </w:p>
     <w:p>
@@ -80,51 +107,71 @@
         <w:pStyle w:val="Heading2"/>
       </w:pPr>
       <w:r>
-        <w:t xml:space="preserve">   4.2. Penanggung Jawab Hiburan</w:t>
-      </w:r>
-    </w:p>
-    <w:p>
-      <w:r>
-        <w:t>Mengatur kegiatan hiburan selama acara berlangsung.</w:t>
+        <w:t>Divisi Keamanan</w:t>
       </w:r>
     </w:p>
     <w:p>
       <w:pPr>
-        <w:pStyle w:val="Heading1"/>
+        <w:pStyle w:val="ListBullet"/>
       </w:pPr>
       <w:r>
-        <w:t>5. Koordinator Pendaftaran dan Dokumentasi</w:t>
-      </w:r>
-    </w:p>
-    <w:p>
-      <w:r>
-        <w:t>Mengelola pendaftaran peserta dan dokumentasi acara.</w:t>
+        <w:t>Cici</w:t>
       </w:r>
     </w:p>
     <w:p>
       <w:pPr>
-        <w:pStyle w:val="Heading1"/>
+        <w:pStyle w:val="ListBullet"/>
       </w:pPr>
       <w:r>
-        <w:t>6. Tim Humas</w:t>
-      </w:r>
-    </w:p>
-    <w:p>
-      <w:r>
-        <w:t>Mempromosikan acara dan mengelola media sosial serta publikasi.</w:t>
+        <w:t>Dedi</w:t>
       </w:r>
     </w:p>
     <w:p>
       <w:pPr>
-        <w:pStyle w:val="Heading1"/>
+        <w:pStyle w:val="Heading2"/>
       </w:pPr>
       <w:r>
-        <w:t>7. Tim Logistik</w:t>
+        <w:t>Divisi Perlombaan</w:t>
       </w:r>
     </w:p>
     <w:p>
+      <w:pPr>
+        <w:pStyle w:val="ListBullet"/>
+      </w:pPr>
       <w:r>
-        <w:t>Mengatur perlengkapan, perlengkapan teknis, dan kebutuhan logistik lainnya.</w:t>
+        <w:t>Eka</w:t>
+      </w:r>
+    </w:p>
+    <w:p>
+      <w:pPr>
+        <w:pStyle w:val="ListBullet"/>
+      </w:pPr>
+      <w:r>
+        <w:t>Feri</w:t>
+      </w:r>
+    </w:p>
+    <w:p>
+      <w:pPr>
+        <w:pStyle w:val="Heading2"/>
+      </w:pPr>
+      <w:r>
+        <w:t>Divisi Konsumsi</w:t>
+      </w:r>
+    </w:p>
+    <w:p>
+      <w:pPr>
+        <w:pStyle w:val="ListBullet"/>
+      </w:pPr>
+      <w:r>
+        <w:t>Gina</w:t>
+      </w:r>
+    </w:p>
+    <w:p>
+      <w:pPr>
+        <w:pStyle w:val="ListBullet"/>
+      </w:pPr>
+      <w:r>
+        <w:t>Hadi</w:t>
       </w:r>
     </w:p>
     <w:sectPr>

</xml_diff>